<commit_message>
Fix PDF/Word table overflow and remove r4ds attribution from README
- Trim the dataset-summary and model-comparison tables in the Results
  chapter (drop IRI min/max and MAE columns, shorten model names) so
  they fit inside the PDF page margin instead of running off the edge.
- Same fix for the exported Word tables: wide model-metrics tables now
  render landscape with narrow margins and a trimmed column set, with
  a note pointing to the full-detail CSV for anyone who wants every
  column.
- Remove README mentions of the specific book this theme was modeled
  after.

Co-Authored-By: Claude Sonnet 5 <noreply@anthropic.com>
</commit_message>
<xml_diff>
--- a/tables/flexible_all_variants_metrics.docx
+++ b/tables/flexible_all_variants_metrics.docx
@@ -17,26 +17,27 @@
       <w:tblPr>
         <w:tblStyle w:val="LightGrid-Accent1"/>
         <w:tblW w:type="auto" w:w="0"/>
+        <w:tblLayout w:type="autofit"/>
         <w:tblLook w:firstColumn="1" w:firstRow="1" w:lastColumn="0" w:lastRow="0" w:noHBand="0" w:noVBand="1" w:val="04A0"/>
       </w:tblPr>
       <w:tblGrid>
-        <w:gridCol w:w="720"/>
-        <w:gridCol w:w="720"/>
-        <w:gridCol w:w="720"/>
-        <w:gridCol w:w="720"/>
-        <w:gridCol w:w="720"/>
-        <w:gridCol w:w="720"/>
-        <w:gridCol w:w="720"/>
-        <w:gridCol w:w="720"/>
-        <w:gridCol w:w="720"/>
-        <w:gridCol w:w="720"/>
-        <w:gridCol w:w="720"/>
-        <w:gridCol w:w="720"/>
+        <w:gridCol w:w="1176"/>
+        <w:gridCol w:w="1176"/>
+        <w:gridCol w:w="1176"/>
+        <w:gridCol w:w="1176"/>
+        <w:gridCol w:w="1176"/>
+        <w:gridCol w:w="1176"/>
+        <w:gridCol w:w="1176"/>
+        <w:gridCol w:w="1176"/>
+        <w:gridCol w:w="1176"/>
+        <w:gridCol w:w="1176"/>
+        <w:gridCol w:w="1176"/>
+        <w:gridCol w:w="1176"/>
       </w:tblGrid>
       <w:tr>
         <w:tc>
           <w:tcPr>
-            <w:tcW w:type="dxa" w:w="720"/>
+            <w:tcW w:type="dxa" w:w="1176"/>
           </w:tcPr>
           <w:p>
             <w:pPr>
@@ -53,7 +54,7 @@
         </w:tc>
         <w:tc>
           <w:tcPr>
-            <w:tcW w:type="dxa" w:w="720"/>
+            <w:tcW w:type="dxa" w:w="1176"/>
           </w:tcPr>
           <w:p>
             <w:pPr>
@@ -70,7 +71,7 @@
         </w:tc>
         <w:tc>
           <w:tcPr>
-            <w:tcW w:type="dxa" w:w="720"/>
+            <w:tcW w:type="dxa" w:w="1176"/>
           </w:tcPr>
           <w:p>
             <w:pPr>
@@ -87,7 +88,7 @@
         </w:tc>
         <w:tc>
           <w:tcPr>
-            <w:tcW w:type="dxa" w:w="720"/>
+            <w:tcW w:type="dxa" w:w="1176"/>
           </w:tcPr>
           <w:p>
             <w:pPr>
@@ -104,7 +105,7 @@
         </w:tc>
         <w:tc>
           <w:tcPr>
-            <w:tcW w:type="dxa" w:w="720"/>
+            <w:tcW w:type="dxa" w:w="1176"/>
           </w:tcPr>
           <w:p>
             <w:pPr>
@@ -121,7 +122,7 @@
         </w:tc>
         <w:tc>
           <w:tcPr>
-            <w:tcW w:type="dxa" w:w="720"/>
+            <w:tcW w:type="dxa" w:w="1176"/>
           </w:tcPr>
           <w:p>
             <w:pPr>
@@ -138,7 +139,7 @@
         </w:tc>
         <w:tc>
           <w:tcPr>
-            <w:tcW w:type="dxa" w:w="720"/>
+            <w:tcW w:type="dxa" w:w="1176"/>
           </w:tcPr>
           <w:p>
             <w:pPr>
@@ -155,7 +156,7 @@
         </w:tc>
         <w:tc>
           <w:tcPr>
-            <w:tcW w:type="dxa" w:w="720"/>
+            <w:tcW w:type="dxa" w:w="1176"/>
           </w:tcPr>
           <w:p>
             <w:pPr>
@@ -172,7 +173,7 @@
         </w:tc>
         <w:tc>
           <w:tcPr>
-            <w:tcW w:type="dxa" w:w="720"/>
+            <w:tcW w:type="dxa" w:w="1176"/>
           </w:tcPr>
           <w:p>
             <w:pPr>
@@ -189,7 +190,7 @@
         </w:tc>
         <w:tc>
           <w:tcPr>
-            <w:tcW w:type="dxa" w:w="720"/>
+            <w:tcW w:type="dxa" w:w="1176"/>
           </w:tcPr>
           <w:p>
             <w:pPr>
@@ -206,7 +207,7 @@
         </w:tc>
         <w:tc>
           <w:tcPr>
-            <w:tcW w:type="dxa" w:w="720"/>
+            <w:tcW w:type="dxa" w:w="1176"/>
           </w:tcPr>
           <w:p>
             <w:pPr>
@@ -223,7 +224,7 @@
         </w:tc>
         <w:tc>
           <w:tcPr>
-            <w:tcW w:type="dxa" w:w="720"/>
+            <w:tcW w:type="dxa" w:w="1176"/>
           </w:tcPr>
           <w:p>
             <w:pPr>
@@ -242,7 +243,7 @@
       <w:tr>
         <w:tc>
           <w:tcPr>
-            <w:tcW w:type="dxa" w:w="720"/>
+            <w:tcW w:type="dxa" w:w="1176"/>
           </w:tcPr>
           <w:p>
             <w:r>
@@ -255,7 +256,7 @@
         </w:tc>
         <w:tc>
           <w:tcPr>
-            <w:tcW w:type="dxa" w:w="720"/>
+            <w:tcW w:type="dxa" w:w="1176"/>
           </w:tcPr>
           <w:p>
             <w:r>
@@ -268,7 +269,7 @@
         </w:tc>
         <w:tc>
           <w:tcPr>
-            <w:tcW w:type="dxa" w:w="720"/>
+            <w:tcW w:type="dxa" w:w="1176"/>
           </w:tcPr>
           <w:p>
             <w:r>
@@ -281,7 +282,7 @@
         </w:tc>
         <w:tc>
           <w:tcPr>
-            <w:tcW w:type="dxa" w:w="720"/>
+            <w:tcW w:type="dxa" w:w="1176"/>
           </w:tcPr>
           <w:p>
             <w:r>
@@ -294,7 +295,7 @@
         </w:tc>
         <w:tc>
           <w:tcPr>
-            <w:tcW w:type="dxa" w:w="720"/>
+            <w:tcW w:type="dxa" w:w="1176"/>
           </w:tcPr>
           <w:p>
             <w:r>
@@ -307,7 +308,7 @@
         </w:tc>
         <w:tc>
           <w:tcPr>
-            <w:tcW w:type="dxa" w:w="720"/>
+            <w:tcW w:type="dxa" w:w="1176"/>
           </w:tcPr>
           <w:p>
             <w:r>
@@ -319,7 +320,7 @@
         </w:tc>
         <w:tc>
           <w:tcPr>
-            <w:tcW w:type="dxa" w:w="720"/>
+            <w:tcW w:type="dxa" w:w="1176"/>
           </w:tcPr>
           <w:p>
             <w:r>
@@ -331,7 +332,7 @@
         </w:tc>
         <w:tc>
           <w:tcPr>
-            <w:tcW w:type="dxa" w:w="720"/>
+            <w:tcW w:type="dxa" w:w="1176"/>
           </w:tcPr>
           <w:p>
             <w:r>
@@ -344,7 +345,7 @@
         </w:tc>
         <w:tc>
           <w:tcPr>
-            <w:tcW w:type="dxa" w:w="720"/>
+            <w:tcW w:type="dxa" w:w="1176"/>
           </w:tcPr>
           <w:p>
             <w:r>
@@ -357,7 +358,7 @@
         </w:tc>
         <w:tc>
           <w:tcPr>
-            <w:tcW w:type="dxa" w:w="720"/>
+            <w:tcW w:type="dxa" w:w="1176"/>
           </w:tcPr>
           <w:p>
             <w:r>
@@ -370,7 +371,7 @@
         </w:tc>
         <w:tc>
           <w:tcPr>
-            <w:tcW w:type="dxa" w:w="720"/>
+            <w:tcW w:type="dxa" w:w="1176"/>
           </w:tcPr>
           <w:p>
             <w:r>
@@ -383,7 +384,7 @@
         </w:tc>
         <w:tc>
           <w:tcPr>
-            <w:tcW w:type="dxa" w:w="720"/>
+            <w:tcW w:type="dxa" w:w="1176"/>
           </w:tcPr>
           <w:p>
             <w:r>
@@ -398,7 +399,7 @@
       <w:tr>
         <w:tc>
           <w:tcPr>
-            <w:tcW w:type="dxa" w:w="720"/>
+            <w:tcW w:type="dxa" w:w="1176"/>
           </w:tcPr>
           <w:p>
             <w:r>
@@ -411,7 +412,7 @@
         </w:tc>
         <w:tc>
           <w:tcPr>
-            <w:tcW w:type="dxa" w:w="720"/>
+            <w:tcW w:type="dxa" w:w="1176"/>
           </w:tcPr>
           <w:p>
             <w:r>
@@ -424,7 +425,7 @@
         </w:tc>
         <w:tc>
           <w:tcPr>
-            <w:tcW w:type="dxa" w:w="720"/>
+            <w:tcW w:type="dxa" w:w="1176"/>
           </w:tcPr>
           <w:p>
             <w:r>
@@ -437,7 +438,7 @@
         </w:tc>
         <w:tc>
           <w:tcPr>
-            <w:tcW w:type="dxa" w:w="720"/>
+            <w:tcW w:type="dxa" w:w="1176"/>
           </w:tcPr>
           <w:p>
             <w:r>
@@ -450,7 +451,7 @@
         </w:tc>
         <w:tc>
           <w:tcPr>
-            <w:tcW w:type="dxa" w:w="720"/>
+            <w:tcW w:type="dxa" w:w="1176"/>
           </w:tcPr>
           <w:p>
             <w:r>
@@ -463,7 +464,7 @@
         </w:tc>
         <w:tc>
           <w:tcPr>
-            <w:tcW w:type="dxa" w:w="720"/>
+            <w:tcW w:type="dxa" w:w="1176"/>
           </w:tcPr>
           <w:p>
             <w:r>
@@ -475,7 +476,7 @@
         </w:tc>
         <w:tc>
           <w:tcPr>
-            <w:tcW w:type="dxa" w:w="720"/>
+            <w:tcW w:type="dxa" w:w="1176"/>
           </w:tcPr>
           <w:p>
             <w:r>
@@ -487,7 +488,7 @@
         </w:tc>
         <w:tc>
           <w:tcPr>
-            <w:tcW w:type="dxa" w:w="720"/>
+            <w:tcW w:type="dxa" w:w="1176"/>
           </w:tcPr>
           <w:p>
             <w:r>
@@ -500,7 +501,7 @@
         </w:tc>
         <w:tc>
           <w:tcPr>
-            <w:tcW w:type="dxa" w:w="720"/>
+            <w:tcW w:type="dxa" w:w="1176"/>
           </w:tcPr>
           <w:p>
             <w:r>
@@ -513,7 +514,7 @@
         </w:tc>
         <w:tc>
           <w:tcPr>
-            <w:tcW w:type="dxa" w:w="720"/>
+            <w:tcW w:type="dxa" w:w="1176"/>
           </w:tcPr>
           <w:p>
             <w:r>
@@ -526,7 +527,7 @@
         </w:tc>
         <w:tc>
           <w:tcPr>
-            <w:tcW w:type="dxa" w:w="720"/>
+            <w:tcW w:type="dxa" w:w="1176"/>
           </w:tcPr>
           <w:p>
             <w:r>
@@ -539,7 +540,7 @@
         </w:tc>
         <w:tc>
           <w:tcPr>
-            <w:tcW w:type="dxa" w:w="720"/>
+            <w:tcW w:type="dxa" w:w="1176"/>
           </w:tcPr>
           <w:p>
             <w:r>
@@ -554,7 +555,7 @@
       <w:tr>
         <w:tc>
           <w:tcPr>
-            <w:tcW w:type="dxa" w:w="720"/>
+            <w:tcW w:type="dxa" w:w="1176"/>
           </w:tcPr>
           <w:p>
             <w:r>
@@ -567,7 +568,7 @@
         </w:tc>
         <w:tc>
           <w:tcPr>
-            <w:tcW w:type="dxa" w:w="720"/>
+            <w:tcW w:type="dxa" w:w="1176"/>
           </w:tcPr>
           <w:p>
             <w:r>
@@ -580,7 +581,7 @@
         </w:tc>
         <w:tc>
           <w:tcPr>
-            <w:tcW w:type="dxa" w:w="720"/>
+            <w:tcW w:type="dxa" w:w="1176"/>
           </w:tcPr>
           <w:p>
             <w:r>
@@ -593,7 +594,7 @@
         </w:tc>
         <w:tc>
           <w:tcPr>
-            <w:tcW w:type="dxa" w:w="720"/>
+            <w:tcW w:type="dxa" w:w="1176"/>
           </w:tcPr>
           <w:p>
             <w:r>
@@ -606,7 +607,7 @@
         </w:tc>
         <w:tc>
           <w:tcPr>
-            <w:tcW w:type="dxa" w:w="720"/>
+            <w:tcW w:type="dxa" w:w="1176"/>
           </w:tcPr>
           <w:p>
             <w:r>
@@ -619,7 +620,7 @@
         </w:tc>
         <w:tc>
           <w:tcPr>
-            <w:tcW w:type="dxa" w:w="720"/>
+            <w:tcW w:type="dxa" w:w="1176"/>
           </w:tcPr>
           <w:p>
             <w:r>
@@ -632,7 +633,7 @@
         </w:tc>
         <w:tc>
           <w:tcPr>
-            <w:tcW w:type="dxa" w:w="720"/>
+            <w:tcW w:type="dxa" w:w="1176"/>
           </w:tcPr>
           <w:p>
             <w:r>
@@ -644,7 +645,7 @@
         </w:tc>
         <w:tc>
           <w:tcPr>
-            <w:tcW w:type="dxa" w:w="720"/>
+            <w:tcW w:type="dxa" w:w="1176"/>
           </w:tcPr>
           <w:p>
             <w:r>
@@ -657,7 +658,7 @@
         </w:tc>
         <w:tc>
           <w:tcPr>
-            <w:tcW w:type="dxa" w:w="720"/>
+            <w:tcW w:type="dxa" w:w="1176"/>
           </w:tcPr>
           <w:p>
             <w:r>
@@ -670,7 +671,7 @@
         </w:tc>
         <w:tc>
           <w:tcPr>
-            <w:tcW w:type="dxa" w:w="720"/>
+            <w:tcW w:type="dxa" w:w="1176"/>
           </w:tcPr>
           <w:p>
             <w:r>
@@ -683,7 +684,7 @@
         </w:tc>
         <w:tc>
           <w:tcPr>
-            <w:tcW w:type="dxa" w:w="720"/>
+            <w:tcW w:type="dxa" w:w="1176"/>
           </w:tcPr>
           <w:p>
             <w:r>
@@ -696,7 +697,7 @@
         </w:tc>
         <w:tc>
           <w:tcPr>
-            <w:tcW w:type="dxa" w:w="720"/>
+            <w:tcW w:type="dxa" w:w="1176"/>
           </w:tcPr>
           <w:p>
             <w:r>
@@ -711,7 +712,7 @@
       <w:tr>
         <w:tc>
           <w:tcPr>
-            <w:tcW w:type="dxa" w:w="720"/>
+            <w:tcW w:type="dxa" w:w="1176"/>
           </w:tcPr>
           <w:p>
             <w:r>
@@ -724,7 +725,7 @@
         </w:tc>
         <w:tc>
           <w:tcPr>
-            <w:tcW w:type="dxa" w:w="720"/>
+            <w:tcW w:type="dxa" w:w="1176"/>
           </w:tcPr>
           <w:p>
             <w:r>
@@ -737,7 +738,7 @@
         </w:tc>
         <w:tc>
           <w:tcPr>
-            <w:tcW w:type="dxa" w:w="720"/>
+            <w:tcW w:type="dxa" w:w="1176"/>
           </w:tcPr>
           <w:p>
             <w:r>
@@ -750,7 +751,7 @@
         </w:tc>
         <w:tc>
           <w:tcPr>
-            <w:tcW w:type="dxa" w:w="720"/>
+            <w:tcW w:type="dxa" w:w="1176"/>
           </w:tcPr>
           <w:p>
             <w:r>
@@ -763,7 +764,7 @@
         </w:tc>
         <w:tc>
           <w:tcPr>
-            <w:tcW w:type="dxa" w:w="720"/>
+            <w:tcW w:type="dxa" w:w="1176"/>
           </w:tcPr>
           <w:p>
             <w:r>
@@ -776,7 +777,7 @@
         </w:tc>
         <w:tc>
           <w:tcPr>
-            <w:tcW w:type="dxa" w:w="720"/>
+            <w:tcW w:type="dxa" w:w="1176"/>
           </w:tcPr>
           <w:p>
             <w:r>
@@ -789,7 +790,7 @@
         </w:tc>
         <w:tc>
           <w:tcPr>
-            <w:tcW w:type="dxa" w:w="720"/>
+            <w:tcW w:type="dxa" w:w="1176"/>
           </w:tcPr>
           <w:p>
             <w:r>
@@ -802,7 +803,7 @@
         </w:tc>
         <w:tc>
           <w:tcPr>
-            <w:tcW w:type="dxa" w:w="720"/>
+            <w:tcW w:type="dxa" w:w="1176"/>
           </w:tcPr>
           <w:p>
             <w:r>
@@ -815,7 +816,7 @@
         </w:tc>
         <w:tc>
           <w:tcPr>
-            <w:tcW w:type="dxa" w:w="720"/>
+            <w:tcW w:type="dxa" w:w="1176"/>
           </w:tcPr>
           <w:p>
             <w:r>
@@ -828,7 +829,7 @@
         </w:tc>
         <w:tc>
           <w:tcPr>
-            <w:tcW w:type="dxa" w:w="720"/>
+            <w:tcW w:type="dxa" w:w="1176"/>
           </w:tcPr>
           <w:p>
             <w:r>
@@ -841,7 +842,7 @@
         </w:tc>
         <w:tc>
           <w:tcPr>
-            <w:tcW w:type="dxa" w:w="720"/>
+            <w:tcW w:type="dxa" w:w="1176"/>
           </w:tcPr>
           <w:p>
             <w:r>
@@ -854,7 +855,7 @@
         </w:tc>
         <w:tc>
           <w:tcPr>
-            <w:tcW w:type="dxa" w:w="720"/>
+            <w:tcW w:type="dxa" w:w="1176"/>
           </w:tcPr>
           <w:p>
             <w:r>
@@ -869,7 +870,7 @@
       <w:tr>
         <w:tc>
           <w:tcPr>
-            <w:tcW w:type="dxa" w:w="720"/>
+            <w:tcW w:type="dxa" w:w="1176"/>
           </w:tcPr>
           <w:p>
             <w:r>
@@ -882,7 +883,7 @@
         </w:tc>
         <w:tc>
           <w:tcPr>
-            <w:tcW w:type="dxa" w:w="720"/>
+            <w:tcW w:type="dxa" w:w="1176"/>
           </w:tcPr>
           <w:p>
             <w:r>
@@ -895,7 +896,7 @@
         </w:tc>
         <w:tc>
           <w:tcPr>
-            <w:tcW w:type="dxa" w:w="720"/>
+            <w:tcW w:type="dxa" w:w="1176"/>
           </w:tcPr>
           <w:p>
             <w:r>
@@ -908,7 +909,7 @@
         </w:tc>
         <w:tc>
           <w:tcPr>
-            <w:tcW w:type="dxa" w:w="720"/>
+            <w:tcW w:type="dxa" w:w="1176"/>
           </w:tcPr>
           <w:p>
             <w:r>
@@ -921,7 +922,7 @@
         </w:tc>
         <w:tc>
           <w:tcPr>
-            <w:tcW w:type="dxa" w:w="720"/>
+            <w:tcW w:type="dxa" w:w="1176"/>
           </w:tcPr>
           <w:p>
             <w:r>
@@ -934,7 +935,7 @@
         </w:tc>
         <w:tc>
           <w:tcPr>
-            <w:tcW w:type="dxa" w:w="720"/>
+            <w:tcW w:type="dxa" w:w="1176"/>
           </w:tcPr>
           <w:p>
             <w:r>
@@ -946,7 +947,7 @@
         </w:tc>
         <w:tc>
           <w:tcPr>
-            <w:tcW w:type="dxa" w:w="720"/>
+            <w:tcW w:type="dxa" w:w="1176"/>
           </w:tcPr>
           <w:p>
             <w:r>
@@ -958,7 +959,7 @@
         </w:tc>
         <w:tc>
           <w:tcPr>
-            <w:tcW w:type="dxa" w:w="720"/>
+            <w:tcW w:type="dxa" w:w="1176"/>
           </w:tcPr>
           <w:p>
             <w:r>
@@ -971,7 +972,7 @@
         </w:tc>
         <w:tc>
           <w:tcPr>
-            <w:tcW w:type="dxa" w:w="720"/>
+            <w:tcW w:type="dxa" w:w="1176"/>
           </w:tcPr>
           <w:p>
             <w:r>
@@ -984,7 +985,7 @@
         </w:tc>
         <w:tc>
           <w:tcPr>
-            <w:tcW w:type="dxa" w:w="720"/>
+            <w:tcW w:type="dxa" w:w="1176"/>
           </w:tcPr>
           <w:p>
             <w:r>
@@ -997,7 +998,7 @@
         </w:tc>
         <w:tc>
           <w:tcPr>
-            <w:tcW w:type="dxa" w:w="720"/>
+            <w:tcW w:type="dxa" w:w="1176"/>
           </w:tcPr>
           <w:p>
             <w:r>
@@ -1010,7 +1011,7 @@
         </w:tc>
         <w:tc>
           <w:tcPr>
-            <w:tcW w:type="dxa" w:w="720"/>
+            <w:tcW w:type="dxa" w:w="1176"/>
           </w:tcPr>
           <w:p>
             <w:r>
@@ -1025,7 +1026,7 @@
       <w:tr>
         <w:tc>
           <w:tcPr>
-            <w:tcW w:type="dxa" w:w="720"/>
+            <w:tcW w:type="dxa" w:w="1176"/>
           </w:tcPr>
           <w:p>
             <w:r>
@@ -1038,7 +1039,7 @@
         </w:tc>
         <w:tc>
           <w:tcPr>
-            <w:tcW w:type="dxa" w:w="720"/>
+            <w:tcW w:type="dxa" w:w="1176"/>
           </w:tcPr>
           <w:p>
             <w:r>
@@ -1051,7 +1052,7 @@
         </w:tc>
         <w:tc>
           <w:tcPr>
-            <w:tcW w:type="dxa" w:w="720"/>
+            <w:tcW w:type="dxa" w:w="1176"/>
           </w:tcPr>
           <w:p>
             <w:r>
@@ -1064,7 +1065,7 @@
         </w:tc>
         <w:tc>
           <w:tcPr>
-            <w:tcW w:type="dxa" w:w="720"/>
+            <w:tcW w:type="dxa" w:w="1176"/>
           </w:tcPr>
           <w:p>
             <w:r>
@@ -1077,7 +1078,7 @@
         </w:tc>
         <w:tc>
           <w:tcPr>
-            <w:tcW w:type="dxa" w:w="720"/>
+            <w:tcW w:type="dxa" w:w="1176"/>
           </w:tcPr>
           <w:p>
             <w:r>
@@ -1090,7 +1091,7 @@
         </w:tc>
         <w:tc>
           <w:tcPr>
-            <w:tcW w:type="dxa" w:w="720"/>
+            <w:tcW w:type="dxa" w:w="1176"/>
           </w:tcPr>
           <w:p>
             <w:r>
@@ -1102,7 +1103,7 @@
         </w:tc>
         <w:tc>
           <w:tcPr>
-            <w:tcW w:type="dxa" w:w="720"/>
+            <w:tcW w:type="dxa" w:w="1176"/>
           </w:tcPr>
           <w:p>
             <w:r>
@@ -1114,7 +1115,7 @@
         </w:tc>
         <w:tc>
           <w:tcPr>
-            <w:tcW w:type="dxa" w:w="720"/>
+            <w:tcW w:type="dxa" w:w="1176"/>
           </w:tcPr>
           <w:p>
             <w:r>
@@ -1127,7 +1128,7 @@
         </w:tc>
         <w:tc>
           <w:tcPr>
-            <w:tcW w:type="dxa" w:w="720"/>
+            <w:tcW w:type="dxa" w:w="1176"/>
           </w:tcPr>
           <w:p>
             <w:r>
@@ -1140,7 +1141,7 @@
         </w:tc>
         <w:tc>
           <w:tcPr>
-            <w:tcW w:type="dxa" w:w="720"/>
+            <w:tcW w:type="dxa" w:w="1176"/>
           </w:tcPr>
           <w:p>
             <w:r>
@@ -1153,7 +1154,7 @@
         </w:tc>
         <w:tc>
           <w:tcPr>
-            <w:tcW w:type="dxa" w:w="720"/>
+            <w:tcW w:type="dxa" w:w="1176"/>
           </w:tcPr>
           <w:p>
             <w:r>
@@ -1166,7 +1167,7 @@
         </w:tc>
         <w:tc>
           <w:tcPr>
-            <w:tcW w:type="dxa" w:w="720"/>
+            <w:tcW w:type="dxa" w:w="1176"/>
           </w:tcPr>
           <w:p>
             <w:r>
@@ -1181,7 +1182,7 @@
       <w:tr>
         <w:tc>
           <w:tcPr>
-            <w:tcW w:type="dxa" w:w="720"/>
+            <w:tcW w:type="dxa" w:w="1176"/>
           </w:tcPr>
           <w:p>
             <w:r>
@@ -1194,7 +1195,7 @@
         </w:tc>
         <w:tc>
           <w:tcPr>
-            <w:tcW w:type="dxa" w:w="720"/>
+            <w:tcW w:type="dxa" w:w="1176"/>
           </w:tcPr>
           <w:p>
             <w:r>
@@ -1207,7 +1208,7 @@
         </w:tc>
         <w:tc>
           <w:tcPr>
-            <w:tcW w:type="dxa" w:w="720"/>
+            <w:tcW w:type="dxa" w:w="1176"/>
           </w:tcPr>
           <w:p>
             <w:r>
@@ -1220,7 +1221,7 @@
         </w:tc>
         <w:tc>
           <w:tcPr>
-            <w:tcW w:type="dxa" w:w="720"/>
+            <w:tcW w:type="dxa" w:w="1176"/>
           </w:tcPr>
           <w:p>
             <w:r>
@@ -1233,7 +1234,7 @@
         </w:tc>
         <w:tc>
           <w:tcPr>
-            <w:tcW w:type="dxa" w:w="720"/>
+            <w:tcW w:type="dxa" w:w="1176"/>
           </w:tcPr>
           <w:p>
             <w:r>
@@ -1246,7 +1247,7 @@
         </w:tc>
         <w:tc>
           <w:tcPr>
-            <w:tcW w:type="dxa" w:w="720"/>
+            <w:tcW w:type="dxa" w:w="1176"/>
           </w:tcPr>
           <w:p>
             <w:r>
@@ -1259,7 +1260,7 @@
         </w:tc>
         <w:tc>
           <w:tcPr>
-            <w:tcW w:type="dxa" w:w="720"/>
+            <w:tcW w:type="dxa" w:w="1176"/>
           </w:tcPr>
           <w:p>
             <w:r>
@@ -1271,7 +1272,7 @@
         </w:tc>
         <w:tc>
           <w:tcPr>
-            <w:tcW w:type="dxa" w:w="720"/>
+            <w:tcW w:type="dxa" w:w="1176"/>
           </w:tcPr>
           <w:p>
             <w:r>
@@ -1284,7 +1285,7 @@
         </w:tc>
         <w:tc>
           <w:tcPr>
-            <w:tcW w:type="dxa" w:w="720"/>
+            <w:tcW w:type="dxa" w:w="1176"/>
           </w:tcPr>
           <w:p>
             <w:r>
@@ -1297,7 +1298,7 @@
         </w:tc>
         <w:tc>
           <w:tcPr>
-            <w:tcW w:type="dxa" w:w="720"/>
+            <w:tcW w:type="dxa" w:w="1176"/>
           </w:tcPr>
           <w:p>
             <w:r>
@@ -1310,7 +1311,7 @@
         </w:tc>
         <w:tc>
           <w:tcPr>
-            <w:tcW w:type="dxa" w:w="720"/>
+            <w:tcW w:type="dxa" w:w="1176"/>
           </w:tcPr>
           <w:p>
             <w:r>
@@ -1323,7 +1324,7 @@
         </w:tc>
         <w:tc>
           <w:tcPr>
-            <w:tcW w:type="dxa" w:w="720"/>
+            <w:tcW w:type="dxa" w:w="1176"/>
           </w:tcPr>
           <w:p>
             <w:r>
@@ -1338,7 +1339,7 @@
       <w:tr>
         <w:tc>
           <w:tcPr>
-            <w:tcW w:type="dxa" w:w="720"/>
+            <w:tcW w:type="dxa" w:w="1176"/>
           </w:tcPr>
           <w:p>
             <w:r>
@@ -1351,7 +1352,7 @@
         </w:tc>
         <w:tc>
           <w:tcPr>
-            <w:tcW w:type="dxa" w:w="720"/>
+            <w:tcW w:type="dxa" w:w="1176"/>
           </w:tcPr>
           <w:p>
             <w:r>
@@ -1364,7 +1365,7 @@
         </w:tc>
         <w:tc>
           <w:tcPr>
-            <w:tcW w:type="dxa" w:w="720"/>
+            <w:tcW w:type="dxa" w:w="1176"/>
           </w:tcPr>
           <w:p>
             <w:r>
@@ -1377,7 +1378,7 @@
         </w:tc>
         <w:tc>
           <w:tcPr>
-            <w:tcW w:type="dxa" w:w="720"/>
+            <w:tcW w:type="dxa" w:w="1176"/>
           </w:tcPr>
           <w:p>
             <w:r>
@@ -1390,7 +1391,7 @@
         </w:tc>
         <w:tc>
           <w:tcPr>
-            <w:tcW w:type="dxa" w:w="720"/>
+            <w:tcW w:type="dxa" w:w="1176"/>
           </w:tcPr>
           <w:p>
             <w:r>
@@ -1403,7 +1404,7 @@
         </w:tc>
         <w:tc>
           <w:tcPr>
-            <w:tcW w:type="dxa" w:w="720"/>
+            <w:tcW w:type="dxa" w:w="1176"/>
           </w:tcPr>
           <w:p>
             <w:r>
@@ -1416,7 +1417,7 @@
         </w:tc>
         <w:tc>
           <w:tcPr>
-            <w:tcW w:type="dxa" w:w="720"/>
+            <w:tcW w:type="dxa" w:w="1176"/>
           </w:tcPr>
           <w:p>
             <w:r>
@@ -1429,7 +1430,7 @@
         </w:tc>
         <w:tc>
           <w:tcPr>
-            <w:tcW w:type="dxa" w:w="720"/>
+            <w:tcW w:type="dxa" w:w="1176"/>
           </w:tcPr>
           <w:p>
             <w:r>
@@ -1442,7 +1443,7 @@
         </w:tc>
         <w:tc>
           <w:tcPr>
-            <w:tcW w:type="dxa" w:w="720"/>
+            <w:tcW w:type="dxa" w:w="1176"/>
           </w:tcPr>
           <w:p>
             <w:r>
@@ -1455,7 +1456,7 @@
         </w:tc>
         <w:tc>
           <w:tcPr>
-            <w:tcW w:type="dxa" w:w="720"/>
+            <w:tcW w:type="dxa" w:w="1176"/>
           </w:tcPr>
           <w:p>
             <w:r>
@@ -1468,7 +1469,7 @@
         </w:tc>
         <w:tc>
           <w:tcPr>
-            <w:tcW w:type="dxa" w:w="720"/>
+            <w:tcW w:type="dxa" w:w="1176"/>
           </w:tcPr>
           <w:p>
             <w:r>
@@ -1481,7 +1482,7 @@
         </w:tc>
         <w:tc>
           <w:tcPr>
-            <w:tcW w:type="dxa" w:w="720"/>
+            <w:tcW w:type="dxa" w:w="1176"/>
           </w:tcPr>
           <w:p>
             <w:r>
@@ -1496,7 +1497,7 @@
       <w:tr>
         <w:tc>
           <w:tcPr>
-            <w:tcW w:type="dxa" w:w="720"/>
+            <w:tcW w:type="dxa" w:w="1176"/>
           </w:tcPr>
           <w:p>
             <w:r>
@@ -1509,7 +1510,7 @@
         </w:tc>
         <w:tc>
           <w:tcPr>
-            <w:tcW w:type="dxa" w:w="720"/>
+            <w:tcW w:type="dxa" w:w="1176"/>
           </w:tcPr>
           <w:p>
             <w:r>
@@ -1522,7 +1523,7 @@
         </w:tc>
         <w:tc>
           <w:tcPr>
-            <w:tcW w:type="dxa" w:w="720"/>
+            <w:tcW w:type="dxa" w:w="1176"/>
           </w:tcPr>
           <w:p>
             <w:r>
@@ -1535,7 +1536,7 @@
         </w:tc>
         <w:tc>
           <w:tcPr>
-            <w:tcW w:type="dxa" w:w="720"/>
+            <w:tcW w:type="dxa" w:w="1176"/>
           </w:tcPr>
           <w:p>
             <w:r>
@@ -1548,7 +1549,7 @@
         </w:tc>
         <w:tc>
           <w:tcPr>
-            <w:tcW w:type="dxa" w:w="720"/>
+            <w:tcW w:type="dxa" w:w="1176"/>
           </w:tcPr>
           <w:p>
             <w:r>
@@ -1561,7 +1562,7 @@
         </w:tc>
         <w:tc>
           <w:tcPr>
-            <w:tcW w:type="dxa" w:w="720"/>
+            <w:tcW w:type="dxa" w:w="1176"/>
           </w:tcPr>
           <w:p>
             <w:r>
@@ -1573,7 +1574,7 @@
         </w:tc>
         <w:tc>
           <w:tcPr>
-            <w:tcW w:type="dxa" w:w="720"/>
+            <w:tcW w:type="dxa" w:w="1176"/>
           </w:tcPr>
           <w:p>
             <w:r>
@@ -1585,7 +1586,7 @@
         </w:tc>
         <w:tc>
           <w:tcPr>
-            <w:tcW w:type="dxa" w:w="720"/>
+            <w:tcW w:type="dxa" w:w="1176"/>
           </w:tcPr>
           <w:p>
             <w:r>
@@ -1598,7 +1599,7 @@
         </w:tc>
         <w:tc>
           <w:tcPr>
-            <w:tcW w:type="dxa" w:w="720"/>
+            <w:tcW w:type="dxa" w:w="1176"/>
           </w:tcPr>
           <w:p>
             <w:r>
@@ -1611,7 +1612,7 @@
         </w:tc>
         <w:tc>
           <w:tcPr>
-            <w:tcW w:type="dxa" w:w="720"/>
+            <w:tcW w:type="dxa" w:w="1176"/>
           </w:tcPr>
           <w:p>
             <w:r>
@@ -1624,7 +1625,7 @@
         </w:tc>
         <w:tc>
           <w:tcPr>
-            <w:tcW w:type="dxa" w:w="720"/>
+            <w:tcW w:type="dxa" w:w="1176"/>
           </w:tcPr>
           <w:p>
             <w:r>
@@ -1637,7 +1638,7 @@
         </w:tc>
         <w:tc>
           <w:tcPr>
-            <w:tcW w:type="dxa" w:w="720"/>
+            <w:tcW w:type="dxa" w:w="1176"/>
           </w:tcPr>
           <w:p>
             <w:r>
@@ -1652,7 +1653,7 @@
       <w:tr>
         <w:tc>
           <w:tcPr>
-            <w:tcW w:type="dxa" w:w="720"/>
+            <w:tcW w:type="dxa" w:w="1176"/>
           </w:tcPr>
           <w:p>
             <w:r>
@@ -1665,7 +1666,7 @@
         </w:tc>
         <w:tc>
           <w:tcPr>
-            <w:tcW w:type="dxa" w:w="720"/>
+            <w:tcW w:type="dxa" w:w="1176"/>
           </w:tcPr>
           <w:p>
             <w:r>
@@ -1678,7 +1679,7 @@
         </w:tc>
         <w:tc>
           <w:tcPr>
-            <w:tcW w:type="dxa" w:w="720"/>
+            <w:tcW w:type="dxa" w:w="1176"/>
           </w:tcPr>
           <w:p>
             <w:r>
@@ -1691,7 +1692,7 @@
         </w:tc>
         <w:tc>
           <w:tcPr>
-            <w:tcW w:type="dxa" w:w="720"/>
+            <w:tcW w:type="dxa" w:w="1176"/>
           </w:tcPr>
           <w:p>
             <w:r>
@@ -1704,7 +1705,7 @@
         </w:tc>
         <w:tc>
           <w:tcPr>
-            <w:tcW w:type="dxa" w:w="720"/>
+            <w:tcW w:type="dxa" w:w="1176"/>
           </w:tcPr>
           <w:p>
             <w:r>
@@ -1717,7 +1718,7 @@
         </w:tc>
         <w:tc>
           <w:tcPr>
-            <w:tcW w:type="dxa" w:w="720"/>
+            <w:tcW w:type="dxa" w:w="1176"/>
           </w:tcPr>
           <w:p>
             <w:r>
@@ -1729,7 +1730,7 @@
         </w:tc>
         <w:tc>
           <w:tcPr>
-            <w:tcW w:type="dxa" w:w="720"/>
+            <w:tcW w:type="dxa" w:w="1176"/>
           </w:tcPr>
           <w:p>
             <w:r>
@@ -1741,7 +1742,7 @@
         </w:tc>
         <w:tc>
           <w:tcPr>
-            <w:tcW w:type="dxa" w:w="720"/>
+            <w:tcW w:type="dxa" w:w="1176"/>
           </w:tcPr>
           <w:p>
             <w:r>
@@ -1754,7 +1755,7 @@
         </w:tc>
         <w:tc>
           <w:tcPr>
-            <w:tcW w:type="dxa" w:w="720"/>
+            <w:tcW w:type="dxa" w:w="1176"/>
           </w:tcPr>
           <w:p>
             <w:r>
@@ -1767,7 +1768,7 @@
         </w:tc>
         <w:tc>
           <w:tcPr>
-            <w:tcW w:type="dxa" w:w="720"/>
+            <w:tcW w:type="dxa" w:w="1176"/>
           </w:tcPr>
           <w:p>
             <w:r>
@@ -1780,7 +1781,7 @@
         </w:tc>
         <w:tc>
           <w:tcPr>
-            <w:tcW w:type="dxa" w:w="720"/>
+            <w:tcW w:type="dxa" w:w="1176"/>
           </w:tcPr>
           <w:p>
             <w:r>
@@ -1793,7 +1794,7 @@
         </w:tc>
         <w:tc>
           <w:tcPr>
-            <w:tcW w:type="dxa" w:w="720"/>
+            <w:tcW w:type="dxa" w:w="1176"/>
           </w:tcPr>
           <w:p>
             <w:r>
@@ -1808,7 +1809,7 @@
       <w:tr>
         <w:tc>
           <w:tcPr>
-            <w:tcW w:type="dxa" w:w="720"/>
+            <w:tcW w:type="dxa" w:w="1176"/>
           </w:tcPr>
           <w:p>
             <w:r>
@@ -1821,7 +1822,7 @@
         </w:tc>
         <w:tc>
           <w:tcPr>
-            <w:tcW w:type="dxa" w:w="720"/>
+            <w:tcW w:type="dxa" w:w="1176"/>
           </w:tcPr>
           <w:p>
             <w:r>
@@ -1834,7 +1835,7 @@
         </w:tc>
         <w:tc>
           <w:tcPr>
-            <w:tcW w:type="dxa" w:w="720"/>
+            <w:tcW w:type="dxa" w:w="1176"/>
           </w:tcPr>
           <w:p>
             <w:r>
@@ -1847,7 +1848,7 @@
         </w:tc>
         <w:tc>
           <w:tcPr>
-            <w:tcW w:type="dxa" w:w="720"/>
+            <w:tcW w:type="dxa" w:w="1176"/>
           </w:tcPr>
           <w:p>
             <w:r>
@@ -1860,7 +1861,7 @@
         </w:tc>
         <w:tc>
           <w:tcPr>
-            <w:tcW w:type="dxa" w:w="720"/>
+            <w:tcW w:type="dxa" w:w="1176"/>
           </w:tcPr>
           <w:p>
             <w:r>
@@ -1873,7 +1874,7 @@
         </w:tc>
         <w:tc>
           <w:tcPr>
-            <w:tcW w:type="dxa" w:w="720"/>
+            <w:tcW w:type="dxa" w:w="1176"/>
           </w:tcPr>
           <w:p>
             <w:r>
@@ -1886,7 +1887,7 @@
         </w:tc>
         <w:tc>
           <w:tcPr>
-            <w:tcW w:type="dxa" w:w="720"/>
+            <w:tcW w:type="dxa" w:w="1176"/>
           </w:tcPr>
           <w:p>
             <w:r>
@@ -1898,7 +1899,7 @@
         </w:tc>
         <w:tc>
           <w:tcPr>
-            <w:tcW w:type="dxa" w:w="720"/>
+            <w:tcW w:type="dxa" w:w="1176"/>
           </w:tcPr>
           <w:p>
             <w:r>
@@ -1911,7 +1912,7 @@
         </w:tc>
         <w:tc>
           <w:tcPr>
-            <w:tcW w:type="dxa" w:w="720"/>
+            <w:tcW w:type="dxa" w:w="1176"/>
           </w:tcPr>
           <w:p>
             <w:r>
@@ -1924,7 +1925,7 @@
         </w:tc>
         <w:tc>
           <w:tcPr>
-            <w:tcW w:type="dxa" w:w="720"/>
+            <w:tcW w:type="dxa" w:w="1176"/>
           </w:tcPr>
           <w:p>
             <w:r>
@@ -1937,7 +1938,7 @@
         </w:tc>
         <w:tc>
           <w:tcPr>
-            <w:tcW w:type="dxa" w:w="720"/>
+            <w:tcW w:type="dxa" w:w="1176"/>
           </w:tcPr>
           <w:p>
             <w:r>
@@ -1950,7 +1951,7 @@
         </w:tc>
         <w:tc>
           <w:tcPr>
-            <w:tcW w:type="dxa" w:w="720"/>
+            <w:tcW w:type="dxa" w:w="1176"/>
           </w:tcPr>
           <w:p>
             <w:r>
@@ -1965,7 +1966,7 @@
       <w:tr>
         <w:tc>
           <w:tcPr>
-            <w:tcW w:type="dxa" w:w="720"/>
+            <w:tcW w:type="dxa" w:w="1176"/>
           </w:tcPr>
           <w:p>
             <w:r>
@@ -1978,7 +1979,7 @@
         </w:tc>
         <w:tc>
           <w:tcPr>
-            <w:tcW w:type="dxa" w:w="720"/>
+            <w:tcW w:type="dxa" w:w="1176"/>
           </w:tcPr>
           <w:p>
             <w:r>
@@ -1991,7 +1992,7 @@
         </w:tc>
         <w:tc>
           <w:tcPr>
-            <w:tcW w:type="dxa" w:w="720"/>
+            <w:tcW w:type="dxa" w:w="1176"/>
           </w:tcPr>
           <w:p>
             <w:r>
@@ -2004,7 +2005,7 @@
         </w:tc>
         <w:tc>
           <w:tcPr>
-            <w:tcW w:type="dxa" w:w="720"/>
+            <w:tcW w:type="dxa" w:w="1176"/>
           </w:tcPr>
           <w:p>
             <w:r>
@@ -2017,7 +2018,7 @@
         </w:tc>
         <w:tc>
           <w:tcPr>
-            <w:tcW w:type="dxa" w:w="720"/>
+            <w:tcW w:type="dxa" w:w="1176"/>
           </w:tcPr>
           <w:p>
             <w:r>
@@ -2030,7 +2031,7 @@
         </w:tc>
         <w:tc>
           <w:tcPr>
-            <w:tcW w:type="dxa" w:w="720"/>
+            <w:tcW w:type="dxa" w:w="1176"/>
           </w:tcPr>
           <w:p>
             <w:r>
@@ -2043,7 +2044,7 @@
         </w:tc>
         <w:tc>
           <w:tcPr>
-            <w:tcW w:type="dxa" w:w="720"/>
+            <w:tcW w:type="dxa" w:w="1176"/>
           </w:tcPr>
           <w:p>
             <w:r>
@@ -2056,7 +2057,7 @@
         </w:tc>
         <w:tc>
           <w:tcPr>
-            <w:tcW w:type="dxa" w:w="720"/>
+            <w:tcW w:type="dxa" w:w="1176"/>
           </w:tcPr>
           <w:p>
             <w:r>
@@ -2069,7 +2070,7 @@
         </w:tc>
         <w:tc>
           <w:tcPr>
-            <w:tcW w:type="dxa" w:w="720"/>
+            <w:tcW w:type="dxa" w:w="1176"/>
           </w:tcPr>
           <w:p>
             <w:r>
@@ -2082,7 +2083,7 @@
         </w:tc>
         <w:tc>
           <w:tcPr>
-            <w:tcW w:type="dxa" w:w="720"/>
+            <w:tcW w:type="dxa" w:w="1176"/>
           </w:tcPr>
           <w:p>
             <w:r>
@@ -2095,7 +2096,7 @@
         </w:tc>
         <w:tc>
           <w:tcPr>
-            <w:tcW w:type="dxa" w:w="720"/>
+            <w:tcW w:type="dxa" w:w="1176"/>
           </w:tcPr>
           <w:p>
             <w:r>
@@ -2108,7 +2109,7 @@
         </w:tc>
         <w:tc>
           <w:tcPr>
-            <w:tcW w:type="dxa" w:w="720"/>
+            <w:tcW w:type="dxa" w:w="1176"/>
           </w:tcPr>
           <w:p>
             <w:r>
@@ -2122,8 +2123,8 @@
       </w:tr>
     </w:tbl>
     <w:sectPr>
-      <w:pgSz w:w="12240" w:h="15840"/>
-      <w:pgMar w:top="1440" w:right="1800" w:bottom="1440" w:left="1800" w:header="720" w:footer="720" w:gutter="0"/>
+      <w:pgSz w:w="15840" w:h="12240" w:orient="landscape"/>
+      <w:pgMar w:top="864" w:right="864" w:bottom="864" w:left="864" w:header="720" w:footer="720" w:gutter="0"/>
       <w:cols w:space="720"/>
       <w:docGrid w:linePitch="360"/>
     </w:sectPr>

</xml_diff>